<commit_message>
Documentation Update and Code Refactoring
</commit_message>
<xml_diff>
--- a/Projects/Project4.0/Project4_Documentation.docx
+++ b/Projects/Project4.0/Project4_Documentation.docx
@@ -27,6 +27,9 @@
       <w:r>
         <w:t>Author: Rodney</w:t>
       </w:r>
+      <w:r>
+        <w:t xml:space="preserve"> Dennise</w:t>
+      </w:r>
     </w:p>
     <w:p>
       <w:pPr>
@@ -47,188 +50,39 @@
     </w:p>
     <w:p>
       <w:r>
-        <w:t>The program is organized into four classes that separate concerns cleanly: a reusable generic data structure, a domain-specific value type, a custom checked exception, and a GUI controller.</w:t>
-      </w:r>
-    </w:p>
-    <w:p>
-      <w:r>
-        <w:t xml:space="preserve">The Interval class is written as a generic class, Interval&lt;T extends Comparable&lt;T&gt;&gt;, rather than being </w:t>
-      </w:r>
-      <w:proofErr w:type="gramStart"/>
-      <w:r>
-        <w:t>hard-coded</w:t>
-      </w:r>
-      <w:proofErr w:type="gramEnd"/>
-      <w:r>
-        <w:t xml:space="preserve"> to work with Time values. This keeps it reusable for any type that defines a natural ordering – integers, dates, or Time objects – and keeps the comparison logic in one place. The class is immutable: its start and end fields are declared final and set only in the constructor, with no setter methods. Three behaviors were required: </w:t>
-      </w:r>
-      <w:proofErr w:type="gramStart"/>
-      <w:r>
-        <w:t>within(</w:t>
-      </w:r>
-      <w:proofErr w:type="gramEnd"/>
-      <w:r>
-        <w:t xml:space="preserve">), which checks whether a point lies inside the interval inclusive of both endpoints; </w:t>
-      </w:r>
-      <w:proofErr w:type="gramStart"/>
-      <w:r>
-        <w:t>subinterval(</w:t>
-      </w:r>
-      <w:proofErr w:type="gramEnd"/>
-      <w:r>
-        <w:t xml:space="preserve">), which checks whether another interval is completely enclosed by this one; and </w:t>
-      </w:r>
-      <w:proofErr w:type="gramStart"/>
-      <w:r>
-        <w:t>overlaps(</w:t>
-      </w:r>
-      <w:proofErr w:type="gramEnd"/>
-      <w:r>
-        <w:t xml:space="preserve">), which checks whether two intervals share any point at all. Each of these is implemented with a small comparison expression built directly on </w:t>
-      </w:r>
-      <w:proofErr w:type="spellStart"/>
-      <w:proofErr w:type="gramStart"/>
-      <w:r>
-        <w:t>compareTo</w:t>
-      </w:r>
-      <w:proofErr w:type="spellEnd"/>
-      <w:r>
-        <w:t>(</w:t>
-      </w:r>
-      <w:proofErr w:type="gramEnd"/>
-      <w:r>
-        <w:t>), so the class never needs to know anything about the concrete type T.</w:t>
-      </w:r>
-    </w:p>
-    <w:p>
-      <w:r>
-        <w:t xml:space="preserve">The Time class represents a single point in time on a 12-hour clock (hours 1–12, minutes 0–59, and an AM/PM meridian). It implements Comparable&lt;Time&gt; so Interval&lt;Time&gt; objects can rely on ordering. Internally, </w:t>
-      </w:r>
-      <w:proofErr w:type="spellStart"/>
-      <w:proofErr w:type="gramStart"/>
-      <w:r>
-        <w:t>compareTo</w:t>
-      </w:r>
-      <w:proofErr w:type="spellEnd"/>
-      <w:r>
-        <w:t>(</w:t>
-      </w:r>
-      <w:proofErr w:type="gramEnd"/>
-      <w:r>
-        <w:t xml:space="preserve">) converts each Time to “minutes since midnight” on a 24-hour scale before comparing, which avoids subtle bugs around the 12 AM / 12 PM boundary (12 AM is treated as hour 0, and 12 PM is treated as hour 12). Two constructors are provided: one that takes the hour, minute, and meridian directly, and one that parses a string such as “10:30 AM”. Both funnel into a shared </w:t>
-      </w:r>
-      <w:proofErr w:type="gramStart"/>
-      <w:r>
-        <w:t>validate(</w:t>
-      </w:r>
-      <w:proofErr w:type="gramEnd"/>
-      <w:r>
-        <w:t xml:space="preserve">) helper so the range checks (hours 1–12, minutes 0–59, meridian AM or PM) are written once. The string constructor additionally guards against non-numeric input with a try/catch around </w:t>
-      </w:r>
-      <w:proofErr w:type="spellStart"/>
-      <w:r>
-        <w:t>Integer.parseInt</w:t>
-      </w:r>
-      <w:proofErr w:type="spellEnd"/>
-      <w:r>
-        <w:t xml:space="preserve">(), converting any </w:t>
-      </w:r>
-      <w:proofErr w:type="spellStart"/>
-      <w:r>
-        <w:t>NumberFormatException</w:t>
-      </w:r>
-      <w:proofErr w:type="spellEnd"/>
-      <w:r>
-        <w:t xml:space="preserve"> into a </w:t>
-      </w:r>
-      <w:proofErr w:type="spellStart"/>
-      <w:r>
-        <w:t>InvalidTime</w:t>
-      </w:r>
-      <w:proofErr w:type="spellEnd"/>
-      <w:r>
-        <w:t xml:space="preserve"> with a clear message rather than letting an unchecked exception escape.</w:t>
-      </w:r>
-    </w:p>
-    <w:p>
-      <w:proofErr w:type="spellStart"/>
-      <w:r>
-        <w:t>InvalidTime</w:t>
-      </w:r>
-      <w:proofErr w:type="spellEnd"/>
-      <w:r>
-        <w:t xml:space="preserve"> is a checked exception (it extends Exception, not </w:t>
-      </w:r>
-      <w:proofErr w:type="spellStart"/>
-      <w:r>
-        <w:t>RuntimeException</w:t>
-      </w:r>
-      <w:proofErr w:type="spellEnd"/>
-      <w:r>
-        <w:t xml:space="preserve">), which was a deliberate choice matching the assignment spec – it forces every caller that constructs a Time to explicitly handle the possibility of bad input, either by catching it or declaring throws </w:t>
-      </w:r>
-      <w:proofErr w:type="spellStart"/>
-      <w:r>
-        <w:t>InvalidTime</w:t>
-      </w:r>
-      <w:proofErr w:type="spellEnd"/>
-      <w:r>
-        <w:t>, rather than letting invalid times fail silently or crash the program later.</w:t>
-      </w:r>
-    </w:p>
-    <w:p>
-      <w:r>
-        <w:t xml:space="preserve">Project4 is the JavaFX GUI layer and is kept intentionally thin – it holds no business logic of its own. A </w:t>
-      </w:r>
-      <w:proofErr w:type="spellStart"/>
-      <w:r>
-        <w:t>GridPane</w:t>
-      </w:r>
-      <w:proofErr w:type="spellEnd"/>
-      <w:r>
-        <w:t xml:space="preserve"> lays out labeled </w:t>
-      </w:r>
-      <w:proofErr w:type="spellStart"/>
-      <w:r>
-        <w:t>TextFields</w:t>
-      </w:r>
-      <w:proofErr w:type="spellEnd"/>
-      <w:r>
-        <w:t xml:space="preserve"> for both intervals’ start/end times, a field for the time to check, and two read-only output fields. The Compare Intervals and Check Time buttons are wired to private handler methods that parse the current field values into Time objects, build Interval&lt;Time&gt; objects, delegate the actual comparison logic to Interval and Time, and write the resulting message back into the output field. Both handlers are wrapped in a try/catch for </w:t>
-      </w:r>
-      <w:proofErr w:type="spellStart"/>
-      <w:r>
-        <w:t>InvalidTime</w:t>
-      </w:r>
-      <w:proofErr w:type="spellEnd"/>
-      <w:r>
-        <w:t xml:space="preserve"> so that malformed input (for example, “13:00 AM” or a typo) produces a friendly error message in the output field instead of crashing the application.</w:t>
-      </w:r>
-    </w:p>
-    <w:p>
-      <w:r>
-        <w:t xml:space="preserve">One subtlety worth documenting: the </w:t>
-      </w:r>
-      <w:proofErr w:type="gramStart"/>
-      <w:r>
-        <w:t>subinterval(</w:t>
-      </w:r>
-      <w:proofErr w:type="gramEnd"/>
-      <w:r>
-        <w:t xml:space="preserve">) method is invoked on the containing interval, not the contained one. To determine whether Interval 1 is a sub-interval of Interval 2, the code calls interval2.subinterval(interval1). In </w:t>
-      </w:r>
-      <w:proofErr w:type="spellStart"/>
-      <w:proofErr w:type="gramStart"/>
-      <w:r>
-        <w:t>handleCompareIntervals</w:t>
-      </w:r>
-      <w:proofErr w:type="spellEnd"/>
-      <w:r>
-        <w:t>(</w:t>
-      </w:r>
-      <w:proofErr w:type="gramEnd"/>
-      <w:r>
-        <w:t>), the subinterval checks are performed before the overlap check, since a subinterval relationship is technically also an overlap and would otherwise be misreported.</w:t>
+        <w:t>The program is organized into four classes</w:t>
+      </w:r>
+      <w:r>
+        <w:t xml:space="preserve">: </w:t>
+      </w:r>
+      <w:r>
+        <w:t>a reusable generic data structure, a domain-specific value type, a custom checked exception, and a GUI controller.</w:t>
+      </w:r>
+    </w:p>
+    <w:p>
+      <w:r>
+        <w:t>The Interval class is written as a generic class, Interval&lt;T extends Comparable&lt;T&gt;&gt;, rather than being hard-coded to work with Time values. This keeps it reusable for any type that defines a natural ordering – integers, dates, or Time objects – and keeps the comparison logic in one place. The class is immutable: its start and end fields are declared final and set only in the constructor, with no setter methods. Three behaviors were required: within(), which checks whether a point lies inside the interval inclusive of both endpoints; subinterval(), which checks whether another interval is completely enclosed by this one; and overlaps(), which checks whether two intervals share any point at all. Each of these is implemented with a small comparison expression built directly on compareTo(), so the class never needs to know anything about the concrete type T.</w:t>
+      </w:r>
+    </w:p>
+    <w:p>
+      <w:r>
+        <w:t>The Time class represents a single point in time on a 12-hour clock (hours 1–12, minutes 0–59, and an AM/PM meridian). It implements Comparable&lt;Time&gt; so Interval&lt;Time&gt; objects can rely on ordering. Internally, compareTo() converts each Time to “minutes since midnight” on a 24-hour scale before comparing, which avoids subtle bugs around the 12 AM / 12 PM boundary (12 AM is treated as hour 0, and 12 PM is treated as hour 12). Two constructors are provided: one that takes the hour, minute, and meridian directly, and one that parses a string such as “10:30 AM”. Both funnel into a shared validate() helper so the range checks (hours 1–12, minutes 0–59, meridian AM or PM) are written once. The string constructor additionally guards against non-numeric input with a try/catch around Integer.parseInt(), converting any NumberFormatException into a InvalidTime with a clear message rather than letting an unchecked exception escape.</w:t>
+      </w:r>
+    </w:p>
+    <w:p>
+      <w:r>
+        <w:t>InvalidTime is a checked exception (it extends Exception, not RuntimeException), which was a deliberate choice matching the assignment spec – it forces every caller that constructs a Time to explicitly handle the possibility of bad input, either by catching it or declaring throws InvalidTime, rather than letting invalid times fail silently or crash the program later.</w:t>
+      </w:r>
+    </w:p>
+    <w:p>
+      <w:r>
+        <w:t>Project4 is the JavaFX GUI</w:t>
+      </w:r>
+      <w:r>
+        <w:t xml:space="preserve">, a </w:t>
+      </w:r>
+      <w:r>
+        <w:t>GridPane lays out labeled TextFields for both intervals’ start/end times, a field for the time to check, and two read-only output fields. The Compare Intervals and Check Time buttons are wired to private handler methods that parse the current field values into Time objects, build Interval&lt;Time&gt; objects, delegate the actual comparison logic to Interval and Time, and write the resulting message back into the output field. Both handlers are wrapped in a try/catch for InvalidTime so that malformed input (for example, “13:00 AM” or a typo) produces a friendly error message in the output field instead of crashing the application.</w:t>
       </w:r>
     </w:p>
     <w:p/>
@@ -1316,10 +1170,10 @@
         </w:rPr>
         <w:lastRenderedPageBreak/>
         <w:drawing>
-          <wp:inline distT="0" distB="0" distL="0" distR="0" wp14:anchorId="5A8F9DF2" wp14:editId="5A8F9DF3">
-            <wp:extent cx="4429125" cy="3067050"/>
+          <wp:inline distT="0" distB="0" distL="0" distR="0" wp14:anchorId="44DF84C4" wp14:editId="4DF5373B">
+            <wp:extent cx="4349974" cy="3264068"/>
             <wp:effectExtent l="0" t="0" r="0" b="0"/>
-            <wp:docPr id="816222679" name="Picture 816222679"/>
+            <wp:docPr id="655999047" name="Picture 1"/>
             <wp:cNvGraphicFramePr>
               <a:graphicFrameLocks xmlns:a="http://schemas.openxmlformats.org/drawingml/2006/main" noChangeAspect="1"/>
             </wp:cNvGraphicFramePr>
@@ -1327,22 +1181,19 @@
               <a:graphicData uri="http://schemas.openxmlformats.org/drawingml/2006/picture">
                 <pic:pic xmlns:pic="http://schemas.openxmlformats.org/drawingml/2006/picture">
                   <pic:nvPicPr>
-                    <pic:cNvPr id="0" name=""/>
-                    <pic:cNvPicPr>
-                      <a:picLocks noChangeAspect="1" noChangeArrowheads="1"/>
-                    </pic:cNvPicPr>
+                    <pic:cNvPr id="655999047" name=""/>
+                    <pic:cNvPicPr/>
                   </pic:nvPicPr>
                   <pic:blipFill>
                     <a:blip r:embed="rId6"/>
-                    <a:srcRect/>
                     <a:stretch>
                       <a:fillRect/>
                     </a:stretch>
                   </pic:blipFill>
-                  <pic:spPr bwMode="auto">
+                  <pic:spPr>
                     <a:xfrm>
                       <a:off x="0" y="0"/>
-                      <a:ext cx="4429125" cy="3067050"/>
+                      <a:ext cx="4349974" cy="3264068"/>
                     </a:xfrm>
                     <a:prstGeom prst="rect">
                       <a:avLst/>
@@ -1369,14 +1220,11 @@
     </w:p>
     <w:p>
       <w:r>
-        <w:rPr>
-          <w:noProof/>
-        </w:rPr>
         <w:drawing>
-          <wp:inline distT="0" distB="0" distL="0" distR="0" wp14:anchorId="5A8F9DF4" wp14:editId="5A8F9DF5">
-            <wp:extent cx="4429125" cy="3067050"/>
+          <wp:inline distT="0" distB="0" distL="0" distR="0" wp14:anchorId="043DE042" wp14:editId="54D0F56E">
+            <wp:extent cx="4858000" cy="3219615"/>
             <wp:effectExtent l="0" t="0" r="0" b="0"/>
-            <wp:docPr id="1369257145" name="Picture 1369257145"/>
+            <wp:docPr id="1619444144" name="Picture 1"/>
             <wp:cNvGraphicFramePr>
               <a:graphicFrameLocks xmlns:a="http://schemas.openxmlformats.org/drawingml/2006/main" noChangeAspect="1"/>
             </wp:cNvGraphicFramePr>
@@ -1384,22 +1232,19 @@
               <a:graphicData uri="http://schemas.openxmlformats.org/drawingml/2006/picture">
                 <pic:pic xmlns:pic="http://schemas.openxmlformats.org/drawingml/2006/picture">
                   <pic:nvPicPr>
-                    <pic:cNvPr id="0" name=""/>
-                    <pic:cNvPicPr>
-                      <a:picLocks noChangeAspect="1" noChangeArrowheads="1"/>
-                    </pic:cNvPicPr>
+                    <pic:cNvPr id="1619444144" name=""/>
+                    <pic:cNvPicPr/>
                   </pic:nvPicPr>
                   <pic:blipFill>
                     <a:blip r:embed="rId7"/>
-                    <a:srcRect/>
                     <a:stretch>
                       <a:fillRect/>
                     </a:stretch>
                   </pic:blipFill>
-                  <pic:spPr bwMode="auto">
+                  <pic:spPr>
                     <a:xfrm>
                       <a:off x="0" y="0"/>
-                      <a:ext cx="4429125" cy="3067050"/>
+                      <a:ext cx="4858000" cy="3219615"/>
                     </a:xfrm>
                     <a:prstGeom prst="rect">
                       <a:avLst/>
@@ -1426,15 +1271,12 @@
     </w:p>
     <w:p>
       <w:r>
-        <w:rPr>
-          <w:noProof/>
-        </w:rPr>
         <w:lastRenderedPageBreak/>
         <w:drawing>
-          <wp:inline distT="0" distB="0" distL="0" distR="0" wp14:anchorId="5A8F9DF6" wp14:editId="5A8F9DF7">
-            <wp:extent cx="4429125" cy="3067050"/>
+          <wp:inline distT="0" distB="0" distL="0" distR="0" wp14:anchorId="40EFF11C" wp14:editId="50018AB3">
+            <wp:extent cx="4197566" cy="3092609"/>
             <wp:effectExtent l="0" t="0" r="0" b="0"/>
-            <wp:docPr id="1022191042" name="Picture 1022191042"/>
+            <wp:docPr id="273265411" name="Picture 1"/>
             <wp:cNvGraphicFramePr>
               <a:graphicFrameLocks xmlns:a="http://schemas.openxmlformats.org/drawingml/2006/main" noChangeAspect="1"/>
             </wp:cNvGraphicFramePr>
@@ -1442,22 +1284,19 @@
               <a:graphicData uri="http://schemas.openxmlformats.org/drawingml/2006/picture">
                 <pic:pic xmlns:pic="http://schemas.openxmlformats.org/drawingml/2006/picture">
                   <pic:nvPicPr>
-                    <pic:cNvPr id="0" name=""/>
-                    <pic:cNvPicPr>
-                      <a:picLocks noChangeAspect="1" noChangeArrowheads="1"/>
-                    </pic:cNvPicPr>
+                    <pic:cNvPr id="273265411" name=""/>
+                    <pic:cNvPicPr/>
                   </pic:nvPicPr>
                   <pic:blipFill>
                     <a:blip r:embed="rId8"/>
-                    <a:srcRect/>
                     <a:stretch>
                       <a:fillRect/>
                     </a:stretch>
                   </pic:blipFill>
-                  <pic:spPr bwMode="auto">
+                  <pic:spPr>
                     <a:xfrm>
                       <a:off x="0" y="0"/>
-                      <a:ext cx="4429125" cy="3067050"/>
+                      <a:ext cx="4197566" cy="3092609"/>
                     </a:xfrm>
                     <a:prstGeom prst="rect">
                       <a:avLst/>
@@ -1484,14 +1323,11 @@
     </w:p>
     <w:p>
       <w:r>
-        <w:rPr>
-          <w:noProof/>
-        </w:rPr>
         <w:drawing>
-          <wp:inline distT="0" distB="0" distL="0" distR="0" wp14:anchorId="5A8F9DF8" wp14:editId="5A8F9DF9">
-            <wp:extent cx="4429125" cy="3067050"/>
+          <wp:inline distT="0" distB="0" distL="0" distR="0" wp14:anchorId="1768CFD4" wp14:editId="2AF9B575">
+            <wp:extent cx="4191215" cy="3130711"/>
             <wp:effectExtent l="0" t="0" r="0" b="0"/>
-            <wp:docPr id="244266942" name="Picture 244266942"/>
+            <wp:docPr id="1759492532" name="Picture 1"/>
             <wp:cNvGraphicFramePr>
               <a:graphicFrameLocks xmlns:a="http://schemas.openxmlformats.org/drawingml/2006/main" noChangeAspect="1"/>
             </wp:cNvGraphicFramePr>
@@ -1499,22 +1335,19 @@
               <a:graphicData uri="http://schemas.openxmlformats.org/drawingml/2006/picture">
                 <pic:pic xmlns:pic="http://schemas.openxmlformats.org/drawingml/2006/picture">
                   <pic:nvPicPr>
-                    <pic:cNvPr id="0" name=""/>
-                    <pic:cNvPicPr>
-                      <a:picLocks noChangeAspect="1" noChangeArrowheads="1"/>
-                    </pic:cNvPicPr>
+                    <pic:cNvPr id="1759492532" name=""/>
+                    <pic:cNvPicPr/>
                   </pic:nvPicPr>
                   <pic:blipFill>
                     <a:blip r:embed="rId9"/>
-                    <a:srcRect/>
                     <a:stretch>
                       <a:fillRect/>
                     </a:stretch>
                   </pic:blipFill>
-                  <pic:spPr bwMode="auto">
+                  <pic:spPr>
                     <a:xfrm>
                       <a:off x="0" y="0"/>
-                      <a:ext cx="4429125" cy="3067050"/>
+                      <a:ext cx="4191215" cy="3130711"/>
                     </a:xfrm>
                     <a:prstGeom prst="rect">
                       <a:avLst/>
@@ -1541,15 +1374,12 @@
     </w:p>
     <w:p>
       <w:r>
-        <w:rPr>
-          <w:noProof/>
-        </w:rPr>
         <w:lastRenderedPageBreak/>
         <w:drawing>
-          <wp:inline distT="0" distB="0" distL="0" distR="0" wp14:anchorId="5A8F9DFA" wp14:editId="5A8F9DFB">
-            <wp:extent cx="4429125" cy="3067050"/>
+          <wp:inline distT="0" distB="0" distL="0" distR="0" wp14:anchorId="06C61B0A" wp14:editId="7907FD9C">
+            <wp:extent cx="4178515" cy="3111660"/>
             <wp:effectExtent l="0" t="0" r="0" b="0"/>
-            <wp:docPr id="585957845" name="Picture 585957845"/>
+            <wp:docPr id="258662268" name="Picture 1"/>
             <wp:cNvGraphicFramePr>
               <a:graphicFrameLocks xmlns:a="http://schemas.openxmlformats.org/drawingml/2006/main" noChangeAspect="1"/>
             </wp:cNvGraphicFramePr>
@@ -1557,22 +1387,19 @@
               <a:graphicData uri="http://schemas.openxmlformats.org/drawingml/2006/picture">
                 <pic:pic xmlns:pic="http://schemas.openxmlformats.org/drawingml/2006/picture">
                   <pic:nvPicPr>
-                    <pic:cNvPr id="0" name=""/>
-                    <pic:cNvPicPr>
-                      <a:picLocks noChangeAspect="1" noChangeArrowheads="1"/>
-                    </pic:cNvPicPr>
+                    <pic:cNvPr id="258662268" name=""/>
+                    <pic:cNvPicPr/>
                   </pic:nvPicPr>
                   <pic:blipFill>
                     <a:blip r:embed="rId10"/>
-                    <a:srcRect/>
                     <a:stretch>
                       <a:fillRect/>
                     </a:stretch>
                   </pic:blipFill>
-                  <pic:spPr bwMode="auto">
+                  <pic:spPr>
                     <a:xfrm>
                       <a:off x="0" y="0"/>
-                      <a:ext cx="4429125" cy="3067050"/>
+                      <a:ext cx="4178515" cy="3111660"/>
                     </a:xfrm>
                     <a:prstGeom prst="rect">
                       <a:avLst/>
@@ -1599,14 +1426,11 @@
     </w:p>
     <w:p>
       <w:r>
-        <w:rPr>
-          <w:noProof/>
-        </w:rPr>
         <w:drawing>
-          <wp:inline distT="0" distB="0" distL="0" distR="0" wp14:anchorId="5A8F9DFC" wp14:editId="5A8F9DFD">
-            <wp:extent cx="4429125" cy="3067050"/>
+          <wp:inline distT="0" distB="0" distL="0" distR="0" wp14:anchorId="1DB8CBF3" wp14:editId="5574F52E">
+            <wp:extent cx="4248368" cy="3162463"/>
             <wp:effectExtent l="0" t="0" r="0" b="0"/>
-            <wp:docPr id="1975437885" name="Picture 1975437885"/>
+            <wp:docPr id="2118083397" name="Picture 1"/>
             <wp:cNvGraphicFramePr>
               <a:graphicFrameLocks xmlns:a="http://schemas.openxmlformats.org/drawingml/2006/main" noChangeAspect="1"/>
             </wp:cNvGraphicFramePr>
@@ -1614,22 +1438,19 @@
               <a:graphicData uri="http://schemas.openxmlformats.org/drawingml/2006/picture">
                 <pic:pic xmlns:pic="http://schemas.openxmlformats.org/drawingml/2006/picture">
                   <pic:nvPicPr>
-                    <pic:cNvPr id="0" name=""/>
-                    <pic:cNvPicPr>
-                      <a:picLocks noChangeAspect="1" noChangeArrowheads="1"/>
-                    </pic:cNvPicPr>
+                    <pic:cNvPr id="2118083397" name=""/>
+                    <pic:cNvPicPr/>
                   </pic:nvPicPr>
                   <pic:blipFill>
                     <a:blip r:embed="rId11"/>
-                    <a:srcRect/>
                     <a:stretch>
                       <a:fillRect/>
                     </a:stretch>
                   </pic:blipFill>
-                  <pic:spPr bwMode="auto">
+                  <pic:spPr>
                     <a:xfrm>
                       <a:off x="0" y="0"/>
-                      <a:ext cx="4429125" cy="3067050"/>
+                      <a:ext cx="4248368" cy="3162463"/>
                     </a:xfrm>
                     <a:prstGeom prst="rect">
                       <a:avLst/>
@@ -1656,15 +1477,12 @@
     </w:p>
     <w:p>
       <w:r>
-        <w:rPr>
-          <w:noProof/>
-        </w:rPr>
         <w:lastRenderedPageBreak/>
         <w:drawing>
-          <wp:inline distT="0" distB="0" distL="0" distR="0" wp14:anchorId="5A8F9DFE" wp14:editId="5A8F9DFF">
-            <wp:extent cx="4429125" cy="3067050"/>
+          <wp:inline distT="0" distB="0" distL="0" distR="0" wp14:anchorId="17A0AE81" wp14:editId="0A534144">
+            <wp:extent cx="4140413" cy="3111660"/>
             <wp:effectExtent l="0" t="0" r="0" b="0"/>
-            <wp:docPr id="356502504" name="Picture 356502504"/>
+            <wp:docPr id="1588742109" name="Picture 1"/>
             <wp:cNvGraphicFramePr>
               <a:graphicFrameLocks xmlns:a="http://schemas.openxmlformats.org/drawingml/2006/main" noChangeAspect="1"/>
             </wp:cNvGraphicFramePr>
@@ -1672,22 +1490,19 @@
               <a:graphicData uri="http://schemas.openxmlformats.org/drawingml/2006/picture">
                 <pic:pic xmlns:pic="http://schemas.openxmlformats.org/drawingml/2006/picture">
                   <pic:nvPicPr>
-                    <pic:cNvPr id="0" name=""/>
-                    <pic:cNvPicPr>
-                      <a:picLocks noChangeAspect="1" noChangeArrowheads="1"/>
-                    </pic:cNvPicPr>
+                    <pic:cNvPr id="1588742109" name=""/>
+                    <pic:cNvPicPr/>
                   </pic:nvPicPr>
                   <pic:blipFill>
                     <a:blip r:embed="rId12"/>
-                    <a:srcRect/>
                     <a:stretch>
                       <a:fillRect/>
                     </a:stretch>
                   </pic:blipFill>
-                  <pic:spPr bwMode="auto">
+                  <pic:spPr>
                     <a:xfrm>
                       <a:off x="0" y="0"/>
-                      <a:ext cx="4429125" cy="3067050"/>
+                      <a:ext cx="4140413" cy="3111660"/>
                     </a:xfrm>
                     <a:prstGeom prst="rect">
                       <a:avLst/>
@@ -1714,14 +1529,11 @@
     </w:p>
     <w:p>
       <w:r>
-        <w:rPr>
-          <w:noProof/>
-        </w:rPr>
         <w:drawing>
-          <wp:inline distT="0" distB="0" distL="0" distR="0" wp14:anchorId="5A8F9E00" wp14:editId="5A8F9E01">
-            <wp:extent cx="4429125" cy="3067050"/>
+          <wp:inline distT="0" distB="0" distL="0" distR="0" wp14:anchorId="128C3E52" wp14:editId="293F983F">
+            <wp:extent cx="4216617" cy="3238666"/>
             <wp:effectExtent l="0" t="0" r="0" b="0"/>
-            <wp:docPr id="429221564" name="Picture 429221564"/>
+            <wp:docPr id="738357832" name="Picture 1"/>
             <wp:cNvGraphicFramePr>
               <a:graphicFrameLocks xmlns:a="http://schemas.openxmlformats.org/drawingml/2006/main" noChangeAspect="1"/>
             </wp:cNvGraphicFramePr>
@@ -1729,22 +1541,19 @@
               <a:graphicData uri="http://schemas.openxmlformats.org/drawingml/2006/picture">
                 <pic:pic xmlns:pic="http://schemas.openxmlformats.org/drawingml/2006/picture">
                   <pic:nvPicPr>
-                    <pic:cNvPr id="0" name=""/>
-                    <pic:cNvPicPr>
-                      <a:picLocks noChangeAspect="1" noChangeArrowheads="1"/>
-                    </pic:cNvPicPr>
+                    <pic:cNvPr id="738357832" name=""/>
+                    <pic:cNvPicPr/>
                   </pic:nvPicPr>
                   <pic:blipFill>
                     <a:blip r:embed="rId13"/>
-                    <a:srcRect/>
                     <a:stretch>
                       <a:fillRect/>
                     </a:stretch>
                   </pic:blipFill>
-                  <pic:spPr bwMode="auto">
+                  <pic:spPr>
                     <a:xfrm>
                       <a:off x="0" y="0"/>
-                      <a:ext cx="4429125" cy="3067050"/>
+                      <a:ext cx="4216617" cy="3238666"/>
                     </a:xfrm>
                     <a:prstGeom prst="rect">
                       <a:avLst/>
@@ -1771,15 +1580,12 @@
     </w:p>
     <w:p>
       <w:r>
-        <w:rPr>
-          <w:noProof/>
-        </w:rPr>
         <w:lastRenderedPageBreak/>
         <w:drawing>
-          <wp:inline distT="0" distB="0" distL="0" distR="0" wp14:anchorId="5A8F9E02" wp14:editId="5A8F9E03">
-            <wp:extent cx="4429125" cy="3067050"/>
+          <wp:inline distT="0" distB="0" distL="0" distR="0" wp14:anchorId="3C53C456" wp14:editId="749FDCC6">
+            <wp:extent cx="4273770" cy="3225966"/>
             <wp:effectExtent l="0" t="0" r="0" b="0"/>
-            <wp:docPr id="1404061769" name="Picture 1404061769"/>
+            <wp:docPr id="1029321544" name="Picture 1"/>
             <wp:cNvGraphicFramePr>
               <a:graphicFrameLocks xmlns:a="http://schemas.openxmlformats.org/drawingml/2006/main" noChangeAspect="1"/>
             </wp:cNvGraphicFramePr>
@@ -1787,22 +1593,19 @@
               <a:graphicData uri="http://schemas.openxmlformats.org/drawingml/2006/picture">
                 <pic:pic xmlns:pic="http://schemas.openxmlformats.org/drawingml/2006/picture">
                   <pic:nvPicPr>
-                    <pic:cNvPr id="0" name=""/>
-                    <pic:cNvPicPr>
-                      <a:picLocks noChangeAspect="1" noChangeArrowheads="1"/>
-                    </pic:cNvPicPr>
+                    <pic:cNvPr id="1029321544" name=""/>
+                    <pic:cNvPicPr/>
                   </pic:nvPicPr>
                   <pic:blipFill>
                     <a:blip r:embed="rId14"/>
-                    <a:srcRect/>
                     <a:stretch>
                       <a:fillRect/>
                     </a:stretch>
                   </pic:blipFill>
-                  <pic:spPr bwMode="auto">
+                  <pic:spPr>
                     <a:xfrm>
                       <a:off x="0" y="0"/>
-                      <a:ext cx="4429125" cy="3067050"/>
+                      <a:ext cx="4273770" cy="3225966"/>
                     </a:xfrm>
                     <a:prstGeom prst="rect">
                       <a:avLst/>
@@ -1829,14 +1632,11 @@
     </w:p>
     <w:p>
       <w:r>
-        <w:rPr>
-          <w:noProof/>
-        </w:rPr>
         <w:drawing>
-          <wp:inline distT="0" distB="0" distL="0" distR="0" wp14:anchorId="5A8F9E04" wp14:editId="5A8F9E05">
-            <wp:extent cx="4429125" cy="3067050"/>
+          <wp:inline distT="0" distB="0" distL="0" distR="0" wp14:anchorId="71199713" wp14:editId="7DC595B8">
+            <wp:extent cx="4229317" cy="3143412"/>
             <wp:effectExtent l="0" t="0" r="0" b="0"/>
-            <wp:docPr id="743480434" name="Picture 743480434"/>
+            <wp:docPr id="1650816616" name="Picture 1"/>
             <wp:cNvGraphicFramePr>
               <a:graphicFrameLocks xmlns:a="http://schemas.openxmlformats.org/drawingml/2006/main" noChangeAspect="1"/>
             </wp:cNvGraphicFramePr>
@@ -1844,22 +1644,19 @@
               <a:graphicData uri="http://schemas.openxmlformats.org/drawingml/2006/picture">
                 <pic:pic xmlns:pic="http://schemas.openxmlformats.org/drawingml/2006/picture">
                   <pic:nvPicPr>
-                    <pic:cNvPr id="0" name=""/>
-                    <pic:cNvPicPr>
-                      <a:picLocks noChangeAspect="1" noChangeArrowheads="1"/>
-                    </pic:cNvPicPr>
+                    <pic:cNvPr id="1650816616" name=""/>
+                    <pic:cNvPicPr/>
                   </pic:nvPicPr>
                   <pic:blipFill>
                     <a:blip r:embed="rId15"/>
-                    <a:srcRect/>
                     <a:stretch>
                       <a:fillRect/>
                     </a:stretch>
                   </pic:blipFill>
-                  <pic:spPr bwMode="auto">
+                  <pic:spPr>
                     <a:xfrm>
                       <a:off x="0" y="0"/>
-                      <a:ext cx="4429125" cy="3067050"/>
+                      <a:ext cx="4229317" cy="3143412"/>
                     </a:xfrm>
                     <a:prstGeom prst="rect">
                       <a:avLst/>
@@ -1886,15 +1683,12 @@
     </w:p>
     <w:p>
       <w:r>
-        <w:rPr>
-          <w:noProof/>
-        </w:rPr>
         <w:lastRenderedPageBreak/>
         <w:drawing>
-          <wp:inline distT="0" distB="0" distL="0" distR="0" wp14:anchorId="5A8F9E06" wp14:editId="5A8F9E07">
-            <wp:extent cx="4429125" cy="3067050"/>
+          <wp:inline distT="0" distB="0" distL="0" distR="0" wp14:anchorId="0EAD7D3F" wp14:editId="30AAA125">
+            <wp:extent cx="4235668" cy="3245017"/>
             <wp:effectExtent l="0" t="0" r="0" b="0"/>
-            <wp:docPr id="1890580308" name="Picture 1890580308"/>
+            <wp:docPr id="962551645" name="Picture 1"/>
             <wp:cNvGraphicFramePr>
               <a:graphicFrameLocks xmlns:a="http://schemas.openxmlformats.org/drawingml/2006/main" noChangeAspect="1"/>
             </wp:cNvGraphicFramePr>
@@ -1902,22 +1696,19 @@
               <a:graphicData uri="http://schemas.openxmlformats.org/drawingml/2006/picture">
                 <pic:pic xmlns:pic="http://schemas.openxmlformats.org/drawingml/2006/picture">
                   <pic:nvPicPr>
-                    <pic:cNvPr id="0" name=""/>
-                    <pic:cNvPicPr>
-                      <a:picLocks noChangeAspect="1" noChangeArrowheads="1"/>
-                    </pic:cNvPicPr>
+                    <pic:cNvPr id="962551645" name=""/>
+                    <pic:cNvPicPr/>
                   </pic:nvPicPr>
                   <pic:blipFill>
                     <a:blip r:embed="rId16"/>
-                    <a:srcRect/>
                     <a:stretch>
                       <a:fillRect/>
                     </a:stretch>
                   </pic:blipFill>
-                  <pic:spPr bwMode="auto">
+                  <pic:spPr>
                     <a:xfrm>
                       <a:off x="0" y="0"/>
-                      <a:ext cx="4429125" cy="3067050"/>
+                      <a:ext cx="4235668" cy="3245017"/>
                     </a:xfrm>
                     <a:prstGeom prst="rect">
                       <a:avLst/>
@@ -1944,14 +1735,11 @@
     </w:p>
     <w:p>
       <w:r>
-        <w:rPr>
-          <w:noProof/>
-        </w:rPr>
         <w:drawing>
-          <wp:inline distT="0" distB="0" distL="0" distR="0" wp14:anchorId="5A8F9E08" wp14:editId="5A8F9E09">
-            <wp:extent cx="4429125" cy="3067050"/>
+          <wp:inline distT="0" distB="0" distL="0" distR="0" wp14:anchorId="2D0E7C37" wp14:editId="1FC00DCB">
+            <wp:extent cx="4210266" cy="3130711"/>
             <wp:effectExtent l="0" t="0" r="0" b="0"/>
-            <wp:docPr id="1061199092" name="Picture 1061199092"/>
+            <wp:docPr id="797236544" name="Picture 1"/>
             <wp:cNvGraphicFramePr>
               <a:graphicFrameLocks xmlns:a="http://schemas.openxmlformats.org/drawingml/2006/main" noChangeAspect="1"/>
             </wp:cNvGraphicFramePr>
@@ -1959,22 +1747,19 @@
               <a:graphicData uri="http://schemas.openxmlformats.org/drawingml/2006/picture">
                 <pic:pic xmlns:pic="http://schemas.openxmlformats.org/drawingml/2006/picture">
                   <pic:nvPicPr>
-                    <pic:cNvPr id="0" name=""/>
-                    <pic:cNvPicPr>
-                      <a:picLocks noChangeAspect="1" noChangeArrowheads="1"/>
-                    </pic:cNvPicPr>
+                    <pic:cNvPr id="797236544" name=""/>
+                    <pic:cNvPicPr/>
                   </pic:nvPicPr>
                   <pic:blipFill>
                     <a:blip r:embed="rId17"/>
-                    <a:srcRect/>
                     <a:stretch>
                       <a:fillRect/>
                     </a:stretch>
                   </pic:blipFill>
-                  <pic:spPr bwMode="auto">
+                  <pic:spPr>
                     <a:xfrm>
                       <a:off x="0" y="0"/>
-                      <a:ext cx="4429125" cy="3067050"/>
+                      <a:ext cx="4210266" cy="3130711"/>
                     </a:xfrm>
                     <a:prstGeom prst="rect">
                       <a:avLst/>
@@ -1998,52 +1783,13 @@
     </w:p>
     <w:p>
       <w:r>
-        <w:t xml:space="preserve">[Draft – personalize before submitting.] Writing Interval as a generic class reinforced how much cleaner it is to build reusable data structures around an interface like Comparable rather than </w:t>
-      </w:r>
-      <w:proofErr w:type="gramStart"/>
-      <w:r>
-        <w:t>hard-coding</w:t>
-      </w:r>
-      <w:proofErr w:type="gramEnd"/>
-      <w:r>
-        <w:t xml:space="preserve"> a single type; the same class could support Interval&lt;Integer&gt; or Interval&lt;</w:t>
-      </w:r>
-      <w:proofErr w:type="spellStart"/>
-      <w:r>
-        <w:t>LocalDate</w:t>
-      </w:r>
-      <w:proofErr w:type="spellEnd"/>
-      <w:r>
-        <w:t xml:space="preserve">&gt; with no changes. Implementing </w:t>
-      </w:r>
-      <w:proofErr w:type="spellStart"/>
-      <w:proofErr w:type="gramStart"/>
-      <w:r>
-        <w:t>compareTo</w:t>
-      </w:r>
-      <w:proofErr w:type="spellEnd"/>
-      <w:r>
-        <w:t>(</w:t>
-      </w:r>
-      <w:proofErr w:type="gramEnd"/>
-      <w:r>
-        <w:t>) for a 12-hour clock was a good reminder that boundary values (12 AM and 12 PM) deserve dedicated test cases, since the naive “hour + 12 for PM” conversion is wrong exactly at those two points. Using a checked exception (</w:t>
-      </w:r>
-      <w:proofErr w:type="spellStart"/>
-      <w:r>
-        <w:t>InvalidTime</w:t>
-      </w:r>
-      <w:proofErr w:type="spellEnd"/>
-      <w:r>
-        <w:t xml:space="preserve">) instead of an unchecked one also made the invalid-input handling more visible and deliberate throughout the codebase, since the compiler enforces that every call site </w:t>
-      </w:r>
-      <w:proofErr w:type="gramStart"/>
-      <w:r>
-        <w:t>consider</w:t>
-      </w:r>
-      <w:proofErr w:type="gramEnd"/>
-      <w:r>
-        <w:t xml:space="preserve"> the failure case.</w:t>
+        <w:t xml:space="preserve">Implementing compareTo() for a 12-hour clock was a good reminder that boundary values (12 AM and 12 PM) deserve dedicated test cases, since “hour + 12 for PM” conversion is wrong exactly at those two points. Using a checked exception (InvalidTime) instead of an unchecked one also made the invalid-input handling more visible and deliberate throughout the codebase, since the compiler enforces that every call site </w:t>
+      </w:r>
+      <w:r>
+        <w:t xml:space="preserve">should </w:t>
+      </w:r>
+      <w:r>
+        <w:t>consider the failure case.</w:t>
       </w:r>
     </w:p>
     <w:sectPr>

</xml_diff>